<commit_message>
Smart Invoice: symbool + beheerbalk + handleiding
</commit_message>
<xml_diff>
--- a/Docs/Handleiding-Smart-Admin.docx
+++ b/Docs/Handleiding-Smart-Admin.docx
@@ -677,7 +677,7 @@
           <w:sz w:val="21"/>
           <w:szCs w:val="21"/>
         </w:rPr>
-        <w:t xml:space="preserve">. Vul je bedrijfsnaam in en upload eventueel je logo. Deze gegevens komen automatisch op je offertes en facturen te staan.</w:t>
+        <w:t xml:space="preserve">. Vul je bedrijfsnaam in en upload eventueel je logo. Deze gegevens komen automatisch op je offertes en facturen te staan — én op de facturen die je in de mobiele app Smart Invoice maakt.</w:t>
       </w:r>
     </w:p>
     <w:p>
@@ -3056,7 +3056,7 @@
           <w:sz w:val="21"/>
           <w:szCs w:val="21"/>
         </w:rPr>
-        <w:t xml:space="preserve">Bedrijfsnaam, gegevens en logo voor op je offertes en facturen.</w:t>
+        <w:t xml:space="preserve">Bedrijfsnaam, gegevens en logo voor op je offertes en facturen. Deze gegevens gebruikt ook Smart Invoice (de mobiele app) automatisch voor de factuurkop — je beheert ze op één plek.</w:t>
       </w:r>
     </w:p>
     <w:p>
@@ -3574,6 +3574,167 @@
           <w:szCs w:val="21"/>
         </w:rPr>
         <w:t xml:space="preserve"> vul je zelf: het saldo van je zakelijke rekening(en) per vandaag. De rekenmachine eronder telt meerdere rekeningen op. Dit saldo komt terug op de balans onder “Bank en kas”. Aan een automatische bankkoppeling wordt gewerkt; daarvan word je automatisch op de hoogte gehouden.</w:t>
+      </w:r>
+    </w:p>
+    <w:p>
+      <w:pPr>
+        <w:pStyle w:val="Heading2"/>
+        <w:spacing w:after="140" w:before="300"/>
+      </w:pPr>
+      <w:r>
+        <w:rPr>
+          <w:rFonts w:ascii="Calibri" w:cs="Calibri" w:eastAsia="Calibri" w:hAnsi="Calibri"/>
+          <w:b/>
+          <w:bCs/>
+          <w:color w:val="1B2C4F"/>
+          <w:sz w:val="26"/>
+          <w:szCs w:val="26"/>
+        </w:rPr>
+        <w:t xml:space="preserve">2.4 Smart Invoice — mobiel factureren en scannen</w:t>
+      </w:r>
+    </w:p>
+    <w:p>
+      <w:pPr>
+        <w:spacing w:after="140" w:line="276"/>
+      </w:pPr>
+      <w:r>
+        <w:rPr>
+          <w:rFonts w:ascii="Calibri" w:cs="Calibri" w:eastAsia="Calibri" w:hAnsi="Calibri"/>
+          <w:b/>
+          <w:bCs/>
+          <w:color w:val="2A2A28"/>
+          <w:sz w:val="21"/>
+          <w:szCs w:val="21"/>
+        </w:rPr>
+        <w:t xml:space="preserve">Smart Invoice</w:t>
+      </w:r>
+      <w:r>
+        <w:rPr>
+          <w:rFonts w:ascii="Calibri" w:cs="Calibri" w:eastAsia="Calibri" w:hAnsi="Calibri"/>
+          <w:color w:val="2A2A28"/>
+          <w:sz w:val="21"/>
+          <w:szCs w:val="21"/>
+        </w:rPr>
+        <w:t xml:space="preserve"> is de gratis mobiele metgezel van Smart Admin, te vinden op </w:t>
+      </w:r>
+      <w:r>
+        <w:rPr>
+          <w:rFonts w:ascii="Calibri" w:cs="Calibri" w:eastAsia="Calibri" w:hAnsi="Calibri"/>
+          <w:b/>
+          <w:bCs/>
+          <w:color w:val="2A2A28"/>
+          <w:sz w:val="21"/>
+          <w:szCs w:val="21"/>
+        </w:rPr>
+        <w:t xml:space="preserve">fluid-waves-admin.vercel.app/invoice/</w:t>
+      </w:r>
+      <w:r>
+        <w:rPr>
+          <w:rFonts w:ascii="Calibri" w:cs="Calibri" w:eastAsia="Calibri" w:hAnsi="Calibri"/>
+          <w:color w:val="2A2A28"/>
+          <w:sz w:val="21"/>
+          <w:szCs w:val="21"/>
+        </w:rPr>
+        <w:t xml:space="preserve">. Je logt in met hetzelfde account. Onderweg scan je met je telefoon een bon of maak je snel een factuur; je scans komen rechtstreeks binnen in de </w:t>
+      </w:r>
+      <w:r>
+        <w:rPr>
+          <w:rFonts w:ascii="Calibri" w:cs="Calibri" w:eastAsia="Calibri" w:hAnsi="Calibri"/>
+          <w:b/>
+          <w:bCs/>
+          <w:color w:val="2A2A28"/>
+          <w:sz w:val="21"/>
+          <w:szCs w:val="21"/>
+        </w:rPr>
+        <w:t xml:space="preserve">verzamelmappen</w:t>
+      </w:r>
+      <w:r>
+        <w:rPr>
+          <w:rFonts w:ascii="Calibri" w:cs="Calibri" w:eastAsia="Calibri" w:hAnsi="Calibri"/>
+          <w:color w:val="2A2A28"/>
+          <w:sz w:val="21"/>
+          <w:szCs w:val="21"/>
+        </w:rPr>
+        <w:t xml:space="preserve"> (menu 3), klaar om te boeken.</w:t>
+      </w:r>
+    </w:p>
+    <w:p>
+      <w:pPr>
+        <w:spacing w:after="140" w:line="276"/>
+      </w:pPr>
+      <w:r>
+        <w:rPr>
+          <w:rFonts w:ascii="Calibri" w:cs="Calibri" w:eastAsia="Calibri" w:hAnsi="Calibri"/>
+          <w:color w:val="2A2A28"/>
+          <w:sz w:val="21"/>
+          <w:szCs w:val="21"/>
+        </w:rPr>
+        <w:t xml:space="preserve">Je hoeft niets dubbel in te richten: je </w:t>
+      </w:r>
+      <w:r>
+        <w:rPr>
+          <w:rFonts w:ascii="Calibri" w:cs="Calibri" w:eastAsia="Calibri" w:hAnsi="Calibri"/>
+          <w:b/>
+          <w:bCs/>
+          <w:color w:val="2A2A28"/>
+          <w:sz w:val="21"/>
+          <w:szCs w:val="21"/>
+        </w:rPr>
+        <w:t xml:space="preserve">bedrijfsgegevens</w:t>
+      </w:r>
+      <w:r>
+        <w:rPr>
+          <w:rFonts w:ascii="Calibri" w:cs="Calibri" w:eastAsia="Calibri" w:hAnsi="Calibri"/>
+          <w:color w:val="2A2A28"/>
+          <w:sz w:val="21"/>
+          <w:szCs w:val="21"/>
+        </w:rPr>
+        <w:t xml:space="preserve"> voor op de factuur beheer je op één plek — hier in Smart Admin, bij </w:t>
+      </w:r>
+      <w:r>
+        <w:rPr>
+          <w:rFonts w:ascii="Calibri" w:cs="Calibri" w:eastAsia="Calibri" w:hAnsi="Calibri"/>
+          <w:b/>
+          <w:bCs/>
+          <w:color w:val="2A2A28"/>
+          <w:sz w:val="21"/>
+          <w:szCs w:val="21"/>
+        </w:rPr>
+        <w:t xml:space="preserve">2. Offertes en Facturen → Mijn bedrijfsgegevens</w:t>
+      </w:r>
+      <w:r>
+        <w:rPr>
+          <w:rFonts w:ascii="Calibri" w:cs="Calibri" w:eastAsia="Calibri" w:hAnsi="Calibri"/>
+          <w:color w:val="2A2A28"/>
+          <w:sz w:val="21"/>
+          <w:szCs w:val="21"/>
+        </w:rPr>
+        <w:t xml:space="preserve">. Smart Invoice gebruikt automatisch dezelfde gegevens, dus je vult ze maar één keer in.</w:t>
+      </w:r>
+    </w:p>
+    <w:p>
+      <w:pPr>
+        <w:spacing w:after="140" w:line="276"/>
+      </w:pPr>
+      <w:r>
+        <w:rPr>
+          <w:rFonts w:ascii="Calibri" w:cs="Calibri" w:eastAsia="Calibri" w:hAnsi="Calibri"/>
+          <w:i/>
+          <w:iCs/>
+          <w:color w:val="2A2A28"/>
+          <w:sz w:val="21"/>
+          <w:szCs w:val="21"/>
+        </w:rPr>
+        <w:t xml:space="preserve">Nog geen Smart Admin? </w:t>
+      </w:r>
+      <w:r>
+        <w:rPr>
+          <w:rFonts w:ascii="Calibri" w:cs="Calibri" w:eastAsia="Calibri" w:hAnsi="Calibri"/>
+          <w:color w:val="2A2A28"/>
+          <w:sz w:val="21"/>
+          <w:szCs w:val="21"/>
+        </w:rPr>
+        <w:t xml:space="preserve">Dan kan Smart Invoice ook los draaien (met een eigen instap-abonnement): je scans en facturen komen in een eigen map, die bij een latere upgrade naar Smart Admin 1-op-1 meegaat.</w:t>
       </w:r>
     </w:p>
     <w:p>

</xml_diff>